<commit_message>
Add latest articles and conference
</commit_message>
<xml_diff>
--- a/2025/Дисс.совет/Документы/Сергей/0 редакция/Колокольчиков_анкетные_данные_соискателя.docx
+++ b/2025/Дисс.совет/Документы/Сергей/0 редакция/Колокольчиков_анкетные_данные_соискателя.docx
@@ -644,7 +644,7 @@
           <w:sz w:val="24"/>
           <w:szCs w:val="24"/>
         </w:rPr>
-        <w:t>Научно-Образовательный Центр</w:t>
+        <w:t>Отдел ускорительного комплекса (ОУК)</w:t>
       </w:r>
     </w:p>
     <w:p>
@@ -1227,8 +1227,82 @@
           <w:szCs w:val="24"/>
         </w:rPr>
         <w:lastRenderedPageBreak/>
-        <w:t>к.ф.-м.н.</w:t>
-      </w:r>
+        <w:t xml:space="preserve">д.ф.-м.н. Мочалов </w:t>
+      </w:r>
+      <w:r>
+        <w:rPr>
+          <w:rFonts w:ascii="Times New Roman" w:hAnsi="Times New Roman" w:cs="Times New Roman"/>
+          <w:sz w:val="24"/>
+          <w:szCs w:val="24"/>
+        </w:rPr>
+        <w:t>Васили</w:t>
+      </w:r>
+      <w:r>
+        <w:rPr>
+          <w:rFonts w:ascii="Times New Roman" w:hAnsi="Times New Roman" w:cs="Times New Roman"/>
+          <w:sz w:val="24"/>
+          <w:szCs w:val="24"/>
+        </w:rPr>
+        <w:t>й</w:t>
+      </w:r>
+      <w:r>
+        <w:rPr>
+          <w:rFonts w:ascii="Times New Roman" w:hAnsi="Times New Roman" w:cs="Times New Roman"/>
+          <w:sz w:val="24"/>
+          <w:szCs w:val="24"/>
+        </w:rPr>
+        <w:t xml:space="preserve"> Вадимови</w:t>
+      </w:r>
+      <w:r>
+        <w:rPr>
+          <w:rFonts w:ascii="Times New Roman" w:hAnsi="Times New Roman" w:cs="Times New Roman"/>
+          <w:sz w:val="24"/>
+          <w:szCs w:val="24"/>
+        </w:rPr>
+        <w:t xml:space="preserve">ч, </w:t>
+      </w:r>
+      <w:bookmarkStart w:id="4" w:name="_Hlk208670927"/>
+      <w:r>
+        <w:rPr>
+          <w:rFonts w:ascii="Times New Roman" w:hAnsi="Times New Roman" w:cs="Times New Roman"/>
+          <w:sz w:val="24"/>
+          <w:szCs w:val="24"/>
+        </w:rPr>
+        <w:t>ведущи</w:t>
+      </w:r>
+      <w:r>
+        <w:rPr>
+          <w:rFonts w:ascii="Times New Roman" w:hAnsi="Times New Roman" w:cs="Times New Roman"/>
+          <w:sz w:val="24"/>
+          <w:szCs w:val="24"/>
+        </w:rPr>
+        <w:t>й</w:t>
+      </w:r>
+      <w:r>
+        <w:rPr>
+          <w:rFonts w:ascii="Times New Roman" w:hAnsi="Times New Roman" w:cs="Times New Roman"/>
+          <w:sz w:val="24"/>
+          <w:szCs w:val="24"/>
+        </w:rPr>
+        <w:t xml:space="preserve"> научны</w:t>
+      </w:r>
+      <w:r>
+        <w:rPr>
+          <w:rFonts w:ascii="Times New Roman" w:hAnsi="Times New Roman" w:cs="Times New Roman"/>
+          <w:sz w:val="24"/>
+          <w:szCs w:val="24"/>
+        </w:rPr>
+        <w:t>й</w:t>
+      </w:r>
+      <w:r>
+        <w:rPr>
+          <w:rFonts w:ascii="Times New Roman" w:hAnsi="Times New Roman" w:cs="Times New Roman"/>
+          <w:sz w:val="24"/>
+          <w:szCs w:val="24"/>
+        </w:rPr>
+        <w:t xml:space="preserve"> сотрудник</w:t>
+      </w:r>
+      <w:bookmarkEnd w:id="4"/>
       <w:r>
         <w:rPr>
           <w:rFonts w:ascii="Times New Roman" w:hAnsi="Times New Roman" w:cs="Times New Roman"/>
@@ -1243,18 +1317,8 @@
           <w:sz w:val="24"/>
           <w:szCs w:val="24"/>
         </w:rPr>
-        <w:t xml:space="preserve">Юрий Николаевич Филатов, </w:t>
-      </w:r>
-      <w:bookmarkStart w:id="4" w:name="_Hlk208668776"/>
-      <w:r>
-        <w:rPr>
-          <w:rFonts w:ascii="Times New Roman" w:hAnsi="Times New Roman" w:cs="Times New Roman"/>
-          <w:sz w:val="24"/>
-          <w:szCs w:val="24"/>
-        </w:rPr>
-        <w:t>заведующий лабораторией, ведущий научный сотрудник</w:t>
-      </w:r>
-      <w:bookmarkEnd w:id="4"/>
+        <w:t>Федеральное государственное бюджетное учреждение «Институт физики высоких энергий имени А.А. Логунова Национального исследовательского центра «Курчатовский институт»</w:t>
+      </w:r>
       <w:r>
         <w:rPr>
           <w:rFonts w:ascii="Times New Roman" w:hAnsi="Times New Roman" w:cs="Times New Roman"/>
@@ -1269,7 +1333,23 @@
           <w:sz w:val="24"/>
           <w:szCs w:val="24"/>
         </w:rPr>
-        <w:t>Федеральное государственное автономное образовательное учреждение высшего образования “Московский физико-технический институт (национальный исследовательский университет)”</w:t>
+        <w:t>Отдел</w:t>
+      </w:r>
+      <w:r>
+        <w:rPr>
+          <w:rFonts w:ascii="Times New Roman" w:hAnsi="Times New Roman" w:cs="Times New Roman"/>
+          <w:sz w:val="24"/>
+          <w:szCs w:val="24"/>
+        </w:rPr>
+        <w:t>ение</w:t>
+      </w:r>
+      <w:r>
+        <w:rPr>
+          <w:rFonts w:ascii="Times New Roman" w:hAnsi="Times New Roman" w:cs="Times New Roman"/>
+          <w:sz w:val="24"/>
+          <w:szCs w:val="24"/>
+        </w:rPr>
+        <w:t xml:space="preserve"> экспериментальной физики</w:t>
       </w:r>
       <w:r>
         <w:rPr>
@@ -1279,31 +1359,53 @@
         </w:rPr>
         <w:t xml:space="preserve">, </w:t>
       </w:r>
-      <w:bookmarkStart w:id="5" w:name="_Hlk208668765"/>
-      <w:r>
-        <w:rPr>
-          <w:rFonts w:ascii="Times New Roman" w:hAnsi="Times New Roman" w:cs="Times New Roman"/>
-          <w:sz w:val="24"/>
-          <w:szCs w:val="24"/>
-        </w:rPr>
-        <w:t>л</w:t>
-      </w:r>
-      <w:r>
-        <w:rPr>
-          <w:rFonts w:ascii="Times New Roman" w:hAnsi="Times New Roman" w:cs="Times New Roman"/>
-          <w:sz w:val="24"/>
-          <w:szCs w:val="24"/>
-        </w:rPr>
-        <w:t>аборатория физики ускорителей</w:t>
-      </w:r>
-      <w:bookmarkEnd w:id="5"/>
-      <w:r>
-        <w:rPr>
-          <w:rFonts w:ascii="Times New Roman" w:hAnsi="Times New Roman" w:cs="Times New Roman"/>
-          <w:sz w:val="24"/>
-          <w:szCs w:val="24"/>
-        </w:rPr>
-        <w:t>, 141701, Московская облаcть, г. Долгопрудный, Институтский пер., 9.</w:t>
+      <w:r>
+        <w:rPr>
+          <w:rFonts w:ascii="Times New Roman" w:hAnsi="Times New Roman" w:cs="Times New Roman"/>
+          <w:sz w:val="24"/>
+          <w:szCs w:val="24"/>
+        </w:rPr>
+        <w:t>142281</w:t>
+      </w:r>
+      <w:r>
+        <w:rPr>
+          <w:rFonts w:ascii="Times New Roman" w:hAnsi="Times New Roman" w:cs="Times New Roman"/>
+          <w:sz w:val="24"/>
+          <w:szCs w:val="24"/>
+        </w:rPr>
+        <w:t xml:space="preserve">, </w:t>
+      </w:r>
+      <w:r>
+        <w:rPr>
+          <w:rFonts w:ascii="Times New Roman" w:hAnsi="Times New Roman" w:cs="Times New Roman"/>
+          <w:sz w:val="24"/>
+          <w:szCs w:val="24"/>
+        </w:rPr>
+        <w:t xml:space="preserve">г. </w:t>
+      </w:r>
+      <w:r>
+        <w:rPr>
+          <w:rFonts w:ascii="Times New Roman" w:hAnsi="Times New Roman" w:cs="Times New Roman"/>
+          <w:sz w:val="24"/>
+          <w:szCs w:val="24"/>
+        </w:rPr>
+        <w:t>Протвино</w:t>
+      </w:r>
+      <w:r>
+        <w:rPr>
+          <w:rFonts w:ascii="Times New Roman" w:hAnsi="Times New Roman" w:cs="Times New Roman"/>
+          <w:sz w:val="24"/>
+          <w:szCs w:val="24"/>
+        </w:rPr>
+        <w:t xml:space="preserve">, </w:t>
+      </w:r>
+      <w:r>
+        <w:rPr>
+          <w:rFonts w:ascii="Times New Roman" w:hAnsi="Times New Roman" w:cs="Times New Roman"/>
+          <w:sz w:val="24"/>
+          <w:szCs w:val="24"/>
+        </w:rPr>
+        <w:t>площадь Науки, дом 1</w:t>
       </w:r>
     </w:p>
     <w:p>
@@ -1326,7 +1428,31 @@
           <w:sz w:val="24"/>
           <w:szCs w:val="24"/>
         </w:rPr>
-        <w:t>д.ф.-м.н.</w:t>
+        <w:t xml:space="preserve">д. т. н. </w:t>
+      </w:r>
+      <w:r>
+        <w:rPr>
+          <w:rFonts w:ascii="Times New Roman" w:hAnsi="Times New Roman" w:cs="Times New Roman"/>
+          <w:sz w:val="24"/>
+          <w:szCs w:val="24"/>
+        </w:rPr>
+        <w:t>Кулевой Тимур Вячеславович</w:t>
+      </w:r>
+      <w:r>
+        <w:rPr>
+          <w:rFonts w:ascii="Times New Roman" w:hAnsi="Times New Roman" w:cs="Times New Roman"/>
+          <w:sz w:val="24"/>
+          <w:szCs w:val="24"/>
+        </w:rPr>
+        <w:t xml:space="preserve">, </w:t>
+      </w:r>
+      <w:r>
+        <w:rPr>
+          <w:rFonts w:ascii="Times New Roman" w:hAnsi="Times New Roman" w:cs="Times New Roman"/>
+          <w:sz w:val="24"/>
+          <w:szCs w:val="24"/>
+        </w:rPr>
+        <w:t>заместитель руководителя</w:t>
       </w:r>
       <w:r>
         <w:rPr>
@@ -1342,7 +1468,7 @@
           <w:sz w:val="24"/>
           <w:szCs w:val="24"/>
         </w:rPr>
-        <w:t>Молчанов</w:t>
+        <w:t>Комплекса по прикладным научным исследованиям и экспериментальным</w:t>
       </w:r>
       <w:r>
         <w:rPr>
@@ -1358,39 +1484,23 @@
           <w:sz w:val="24"/>
           <w:szCs w:val="24"/>
         </w:rPr>
-        <w:t>Васили</w:t>
-      </w:r>
-      <w:r>
-        <w:rPr>
-          <w:rFonts w:ascii="Times New Roman" w:hAnsi="Times New Roman" w:cs="Times New Roman"/>
-          <w:sz w:val="24"/>
-          <w:szCs w:val="24"/>
-        </w:rPr>
-        <w:t>й</w:t>
-      </w:r>
-      <w:r>
-        <w:rPr>
-          <w:rFonts w:ascii="Times New Roman" w:hAnsi="Times New Roman" w:cs="Times New Roman"/>
-          <w:sz w:val="24"/>
-          <w:szCs w:val="24"/>
-        </w:rPr>
-        <w:t xml:space="preserve"> Вадимови</w:t>
-      </w:r>
-      <w:r>
-        <w:rPr>
-          <w:rFonts w:ascii="Times New Roman" w:hAnsi="Times New Roman" w:cs="Times New Roman"/>
-          <w:sz w:val="24"/>
-          <w:szCs w:val="24"/>
-        </w:rPr>
-        <w:t>ч</w:t>
-      </w:r>
-      <w:r>
-        <w:rPr>
-          <w:rFonts w:ascii="Times New Roman" w:hAnsi="Times New Roman" w:cs="Times New Roman"/>
-          <w:sz w:val="24"/>
-          <w:szCs w:val="24"/>
-        </w:rPr>
-        <w:t>,</w:t>
+        <w:t>установкам</w:t>
+      </w:r>
+      <w:r>
+        <w:rPr>
+          <w:rFonts w:ascii="Times New Roman" w:hAnsi="Times New Roman" w:cs="Times New Roman"/>
+          <w:sz w:val="24"/>
+          <w:szCs w:val="24"/>
+        </w:rPr>
+        <w:t xml:space="preserve">, </w:t>
+      </w:r>
+      <w:r>
+        <w:rPr>
+          <w:rFonts w:ascii="Times New Roman" w:hAnsi="Times New Roman" w:cs="Times New Roman"/>
+          <w:sz w:val="24"/>
+          <w:szCs w:val="24"/>
+        </w:rPr>
+        <w:t>Федеральное государственное бюджетное учреждение Национальный</w:t>
       </w:r>
       <w:r>
         <w:rPr>
@@ -1400,55 +1510,29 @@
         </w:rPr>
         <w:t xml:space="preserve"> </w:t>
       </w:r>
-      <w:bookmarkStart w:id="6" w:name="_Hlk208670927"/>
-      <w:r>
-        <w:rPr>
-          <w:rFonts w:ascii="Times New Roman" w:hAnsi="Times New Roman" w:cs="Times New Roman"/>
-          <w:sz w:val="24"/>
-          <w:szCs w:val="24"/>
-        </w:rPr>
-        <w:t>ведущи</w:t>
-      </w:r>
-      <w:r>
-        <w:rPr>
-          <w:rFonts w:ascii="Times New Roman" w:hAnsi="Times New Roman" w:cs="Times New Roman"/>
-          <w:sz w:val="24"/>
-          <w:szCs w:val="24"/>
-        </w:rPr>
-        <w:t>й</w:t>
-      </w:r>
-      <w:r>
-        <w:rPr>
-          <w:rFonts w:ascii="Times New Roman" w:hAnsi="Times New Roman" w:cs="Times New Roman"/>
-          <w:sz w:val="24"/>
-          <w:szCs w:val="24"/>
-        </w:rPr>
-        <w:t xml:space="preserve"> научны</w:t>
-      </w:r>
-      <w:r>
-        <w:rPr>
-          <w:rFonts w:ascii="Times New Roman" w:hAnsi="Times New Roman" w:cs="Times New Roman"/>
-          <w:sz w:val="24"/>
-          <w:szCs w:val="24"/>
-        </w:rPr>
-        <w:t>й</w:t>
-      </w:r>
-      <w:r>
-        <w:rPr>
-          <w:rFonts w:ascii="Times New Roman" w:hAnsi="Times New Roman" w:cs="Times New Roman"/>
-          <w:sz w:val="24"/>
-          <w:szCs w:val="24"/>
-        </w:rPr>
-        <w:t xml:space="preserve"> сотрудник</w:t>
-      </w:r>
-      <w:bookmarkEnd w:id="6"/>
-      <w:r>
-        <w:rPr>
-          <w:rFonts w:ascii="Times New Roman" w:hAnsi="Times New Roman" w:cs="Times New Roman"/>
-          <w:sz w:val="24"/>
-          <w:szCs w:val="24"/>
-        </w:rPr>
-        <w:t>,</w:t>
+      <w:r>
+        <w:rPr>
+          <w:rFonts w:ascii="Times New Roman" w:hAnsi="Times New Roman" w:cs="Times New Roman"/>
+          <w:sz w:val="24"/>
+          <w:szCs w:val="24"/>
+        </w:rPr>
+        <w:t>исследовательский центр «Курчатовский институт»</w:t>
+      </w:r>
+      <w:r>
+        <w:rPr>
+          <w:rFonts w:ascii="Times New Roman" w:hAnsi="Times New Roman" w:cs="Times New Roman"/>
+          <w:sz w:val="24"/>
+          <w:szCs w:val="24"/>
+        </w:rPr>
+        <w:t xml:space="preserve">, </w:t>
+      </w:r>
+      <w:r>
+        <w:rPr>
+          <w:rFonts w:ascii="Times New Roman" w:hAnsi="Times New Roman" w:cs="Times New Roman"/>
+          <w:sz w:val="24"/>
+          <w:szCs w:val="24"/>
+        </w:rPr>
+        <w:t>Курчатовский комплекс</w:t>
       </w:r>
       <w:r>
         <w:rPr>
@@ -1464,79 +1548,23 @@
           <w:sz w:val="24"/>
           <w:szCs w:val="24"/>
         </w:rPr>
-        <w:t xml:space="preserve">Федеральное государственное бюджетное учреждение Национальный исследовательский центр «Курчатовский институт», </w:t>
-      </w:r>
-      <w:r>
-        <w:rPr>
-          <w:rFonts w:ascii="Times New Roman" w:hAnsi="Times New Roman" w:cs="Times New Roman"/>
-          <w:sz w:val="24"/>
-          <w:szCs w:val="24"/>
-        </w:rPr>
-        <w:t>Отдел</w:t>
-      </w:r>
-      <w:r>
-        <w:rPr>
-          <w:rFonts w:ascii="Times New Roman" w:hAnsi="Times New Roman" w:cs="Times New Roman"/>
-          <w:sz w:val="24"/>
-          <w:szCs w:val="24"/>
-        </w:rPr>
-        <w:t>ение</w:t>
-      </w:r>
-      <w:r>
-        <w:rPr>
-          <w:rFonts w:ascii="Times New Roman" w:hAnsi="Times New Roman" w:cs="Times New Roman"/>
-          <w:sz w:val="24"/>
-          <w:szCs w:val="24"/>
-        </w:rPr>
-        <w:t xml:space="preserve"> экспериментальной физики</w:t>
-      </w:r>
-      <w:r>
-        <w:rPr>
-          <w:rFonts w:ascii="Times New Roman" w:hAnsi="Times New Roman" w:cs="Times New Roman"/>
-          <w:sz w:val="24"/>
-          <w:szCs w:val="24"/>
-        </w:rPr>
-        <w:t>,</w:t>
-      </w:r>
-      <w:r>
-        <w:rPr>
-          <w:rFonts w:ascii="Times New Roman" w:hAnsi="Times New Roman" w:cs="Times New Roman"/>
-          <w:sz w:val="24"/>
-          <w:szCs w:val="24"/>
-        </w:rPr>
-        <w:t xml:space="preserve"> </w:t>
-      </w:r>
-      <w:r>
-        <w:rPr>
-          <w:rFonts w:ascii="Times New Roman" w:hAnsi="Times New Roman" w:cs="Times New Roman"/>
-          <w:sz w:val="24"/>
-          <w:szCs w:val="24"/>
-        </w:rPr>
-        <w:t>123098</w:t>
-      </w:r>
-      <w:r>
-        <w:rPr>
-          <w:rFonts w:ascii="Times New Roman" w:hAnsi="Times New Roman" w:cs="Times New Roman"/>
-          <w:sz w:val="24"/>
-          <w:szCs w:val="24"/>
-        </w:rPr>
-        <w:t>,</w:t>
-      </w:r>
-      <w:r>
-        <w:rPr>
-          <w:rFonts w:ascii="Times New Roman" w:hAnsi="Times New Roman" w:cs="Times New Roman"/>
-          <w:sz w:val="24"/>
-          <w:szCs w:val="24"/>
-        </w:rPr>
-        <w:t xml:space="preserve"> </w:t>
-      </w:r>
-      <w:r>
-        <w:rPr>
-          <w:rFonts w:ascii="Times New Roman" w:hAnsi="Times New Roman" w:cs="Times New Roman"/>
-          <w:sz w:val="24"/>
-          <w:szCs w:val="24"/>
-        </w:rPr>
-        <w:t>г. Москва, пл. Академика Курчатова, д. 1</w:t>
+        <w:t>теоретической и экспериментальной физики</w:t>
+      </w:r>
+      <w:r>
+        <w:rPr>
+          <w:rFonts w:ascii="Times New Roman" w:hAnsi="Times New Roman" w:cs="Times New Roman"/>
+          <w:sz w:val="24"/>
+          <w:szCs w:val="24"/>
+        </w:rPr>
+        <w:t xml:space="preserve">, </w:t>
+      </w:r>
+      <w:r>
+        <w:rPr>
+          <w:rFonts w:ascii="Times New Roman" w:hAnsi="Times New Roman" w:cs="Times New Roman"/>
+          <w:sz w:val="24"/>
+          <w:szCs w:val="24"/>
+        </w:rPr>
+        <w:t>117218, г. Москва, ул. Большая Черемушкинская, д. 25</w:t>
       </w:r>
     </w:p>
     <w:p>
@@ -1564,71 +1592,45 @@
         </w:rPr>
         <w:t xml:space="preserve">: </w:t>
       </w:r>
-      <w:bookmarkStart w:id="7" w:name="_Hlk208668799"/>
-      <w:r>
-        <w:rPr>
-          <w:rFonts w:ascii="Times New Roman" w:hAnsi="Times New Roman" w:cs="Times New Roman"/>
-          <w:sz w:val="24"/>
-          <w:szCs w:val="24"/>
-        </w:rPr>
-        <w:t>Международная межправительственная организация Объединенный институт ядерных исследований</w:t>
-      </w:r>
-      <w:bookmarkEnd w:id="7"/>
-      <w:r>
-        <w:rPr>
-          <w:rFonts w:ascii="Times New Roman" w:hAnsi="Times New Roman" w:cs="Times New Roman"/>
-          <w:sz w:val="24"/>
-          <w:szCs w:val="24"/>
-        </w:rPr>
-        <w:t>, 141980, Российская Федерация, Дубна, Московская обл., ул. Жолио-Кюри, д.6. (</w:t>
-      </w:r>
-      <w:r>
-        <w:rPr>
-          <w:rFonts w:ascii="Times New Roman" w:hAnsi="Times New Roman" w:cs="Times New Roman"/>
-          <w:sz w:val="24"/>
-          <w:szCs w:val="24"/>
-        </w:rPr>
-        <w:t xml:space="preserve">тел. </w:t>
-      </w:r>
-      <w:r>
-        <w:rPr>
-          <w:rFonts w:ascii="Times New Roman" w:hAnsi="Times New Roman" w:cs="Times New Roman"/>
-          <w:sz w:val="24"/>
-          <w:szCs w:val="24"/>
-        </w:rPr>
-        <w:t>(496) 216-50-59</w:t>
-      </w:r>
-      <w:r>
-        <w:rPr>
-          <w:rFonts w:ascii="Times New Roman" w:hAnsi="Times New Roman" w:cs="Times New Roman"/>
-          <w:sz w:val="24"/>
-          <w:szCs w:val="24"/>
-        </w:rPr>
-        <w:t>, а</w:t>
-      </w:r>
-      <w:r>
-        <w:rPr>
-          <w:rFonts w:ascii="Times New Roman" w:hAnsi="Times New Roman" w:cs="Times New Roman"/>
-          <w:sz w:val="24"/>
-          <w:szCs w:val="24"/>
-        </w:rPr>
-        <w:t>дрес э</w:t>
-      </w:r>
-      <w:r>
-        <w:rPr>
-          <w:rFonts w:ascii="Times New Roman" w:hAnsi="Times New Roman" w:cs="Times New Roman"/>
-          <w:sz w:val="24"/>
-          <w:szCs w:val="24"/>
-        </w:rPr>
-        <w:t xml:space="preserve">л. </w:t>
-      </w:r>
-      <w:r>
-        <w:rPr>
-          <w:rFonts w:ascii="Times New Roman" w:hAnsi="Times New Roman" w:cs="Times New Roman"/>
-          <w:sz w:val="24"/>
-          <w:szCs w:val="24"/>
-        </w:rPr>
-        <w:t>почты post@jinr.ru)</w:t>
+      <w:r>
+        <w:rPr>
+          <w:rFonts w:ascii="Times New Roman" w:hAnsi="Times New Roman" w:cs="Times New Roman"/>
+          <w:sz w:val="24"/>
+          <w:szCs w:val="24"/>
+        </w:rPr>
+        <w:t>Федеральное государственное бюджетное образовательное учреждение высшего образования «Санкт-Петербургский государственный университет»</w:t>
+      </w:r>
+      <w:r>
+        <w:rPr>
+          <w:rFonts w:ascii="Times New Roman" w:hAnsi="Times New Roman" w:cs="Times New Roman"/>
+          <w:sz w:val="24"/>
+          <w:szCs w:val="24"/>
+        </w:rPr>
+        <w:t xml:space="preserve">, </w:t>
+      </w:r>
+      <w:r>
+        <w:rPr>
+          <w:rFonts w:ascii="Times New Roman" w:hAnsi="Times New Roman" w:cs="Times New Roman"/>
+          <w:sz w:val="24"/>
+          <w:szCs w:val="24"/>
+        </w:rPr>
+        <w:t xml:space="preserve">199034, </w:t>
+      </w:r>
+      <w:r>
+        <w:rPr>
+          <w:rFonts w:ascii="Times New Roman" w:hAnsi="Times New Roman" w:cs="Times New Roman"/>
+          <w:sz w:val="24"/>
+          <w:szCs w:val="24"/>
+        </w:rPr>
+        <w:t xml:space="preserve">г. </w:t>
+      </w:r>
+      <w:r>
+        <w:rPr>
+          <w:rFonts w:ascii="Times New Roman" w:hAnsi="Times New Roman" w:cs="Times New Roman"/>
+          <w:sz w:val="24"/>
+          <w:szCs w:val="24"/>
+        </w:rPr>
+        <w:t>Санкт-Петербург, Университетская наб., д. 7–9</w:t>
       </w:r>
     </w:p>
     <w:p>

</xml_diff>